<commit_message>
feat: informe del proyecto
</commit_message>
<xml_diff>
--- a/docs/Proyecto 2.docx
+++ b/docs/Proyecto 2.docx
@@ -313,6 +313,48 @@
           <w:szCs w:val="28"/>
         </w:rPr>
       </w:pPr>
+      <w:r>
+        <w:rPr>
+          <w:rFonts w:ascii="Times New Roman" w:hAnsi="Times New Roman" w:cs="Times New Roman"/>
+          <w:sz w:val="28"/>
+          <w:szCs w:val="28"/>
+        </w:rPr>
+        <w:drawing>
+          <wp:inline distT="0" distB="0" distL="0" distR="0" wp14:anchorId="12F85DA7" wp14:editId="21655F14">
+            <wp:extent cx="5612130" cy="1813560"/>
+            <wp:effectExtent l="0" t="0" r="7620" b="0"/>
+            <wp:docPr id="975988704" name="Imagen 1"/>
+            <wp:cNvGraphicFramePr>
+              <a:graphicFrameLocks xmlns:a="http://schemas.openxmlformats.org/drawingml/2006/main" noChangeAspect="1"/>
+            </wp:cNvGraphicFramePr>
+            <a:graphic xmlns:a="http://schemas.openxmlformats.org/drawingml/2006/main">
+              <a:graphicData uri="http://schemas.openxmlformats.org/drawingml/2006/picture">
+                <pic:pic xmlns:pic="http://schemas.openxmlformats.org/drawingml/2006/picture">
+                  <pic:nvPicPr>
+                    <pic:cNvPr id="975988704" name=""/>
+                    <pic:cNvPicPr/>
+                  </pic:nvPicPr>
+                  <pic:blipFill>
+                    <a:blip r:embed="rId5"/>
+                    <a:stretch>
+                      <a:fillRect/>
+                    </a:stretch>
+                  </pic:blipFill>
+                  <pic:spPr>
+                    <a:xfrm>
+                      <a:off x="0" y="0"/>
+                      <a:ext cx="5612130" cy="1813560"/>
+                    </a:xfrm>
+                    <a:prstGeom prst="rect">
+                      <a:avLst/>
+                    </a:prstGeom>
+                  </pic:spPr>
+                </pic:pic>
+              </a:graphicData>
+            </a:graphic>
+          </wp:inline>
+        </w:drawing>
+      </w:r>
     </w:p>
     <w:p>
       <w:pPr>
@@ -978,15 +1020,48 @@
       <w:pPr>
         <w:rPr>
           <w:rFonts w:ascii="Times New Roman" w:hAnsi="Times New Roman" w:cs="Times New Roman"/>
-        </w:rPr>
-      </w:pPr>
-    </w:p>
-    <w:p>
-      <w:pPr>
-        <w:rPr>
-          <w:rFonts w:ascii="Times New Roman" w:hAnsi="Times New Roman" w:cs="Times New Roman"/>
-        </w:rPr>
-      </w:pPr>
+          <w:sz w:val="28"/>
+          <w:szCs w:val="28"/>
+        </w:rPr>
+      </w:pPr>
+      <w:proofErr w:type="gramStart"/>
+      <w:r>
+        <w:rPr>
+          <w:rFonts w:ascii="Times New Roman" w:hAnsi="Times New Roman" w:cs="Times New Roman"/>
+          <w:sz w:val="28"/>
+          <w:szCs w:val="28"/>
+        </w:rPr>
+        <w:t>Link</w:t>
+      </w:r>
+      <w:proofErr w:type="gramEnd"/>
+      <w:r>
+        <w:rPr>
+          <w:rFonts w:ascii="Times New Roman" w:hAnsi="Times New Roman" w:cs="Times New Roman"/>
+          <w:sz w:val="28"/>
+          <w:szCs w:val="28"/>
+        </w:rPr>
+        <w:t xml:space="preserve"> de Repositorio de GitHub</w:t>
+      </w:r>
+    </w:p>
+    <w:p>
+      <w:pPr>
+        <w:rPr>
+          <w:rFonts w:ascii="Times New Roman" w:hAnsi="Times New Roman" w:cs="Times New Roman"/>
+          <w:sz w:val="28"/>
+          <w:szCs w:val="28"/>
+        </w:rPr>
+      </w:pPr>
+      <w:hyperlink r:id="rId6" w:history="1">
+        <w:r>
+          <w:rPr>
+            <w:rStyle w:val="Hipervnculo"/>
+            <w:rFonts w:ascii="Times New Roman" w:hAnsi="Times New Roman" w:cs="Times New Roman"/>
+            <w:sz w:val="28"/>
+            <w:szCs w:val="28"/>
+          </w:rPr>
+          <w:t>https://github.com/jsam1904/Proyecto-2-DB.git</w:t>
+        </w:r>
+      </w:hyperlink>
     </w:p>
     <w:sectPr>
       <w:pgSz w:w="12240" w:h="15840"/>
@@ -1001,6 +1076,155 @@
 <file path=word/numbering.xml><?xml version="1.0" encoding="utf-8"?>
 <w:numbering xmlns:wpc="http://schemas.microsoft.com/office/word/2010/wordprocessingCanvas" xmlns:cx="http://schemas.microsoft.com/office/drawing/2014/chartex" xmlns:cx1="http://schemas.microsoft.com/office/drawing/2015/9/8/chartex" xmlns:cx2="http://schemas.microsoft.com/office/drawing/2015/10/21/chartex" xmlns:cx3="http://schemas.microsoft.com/office/drawing/2016/5/9/chartex" xmlns:cx4="http://schemas.microsoft.com/office/drawing/2016/5/10/chartex" xmlns:cx5="http://schemas.microsoft.com/office/drawing/2016/5/11/chartex" xmlns:cx6="http://schemas.microsoft.com/office/drawing/2016/5/12/chartex" xmlns:cx7="http://schemas.microsoft.com/office/drawing/2016/5/13/chartex" xmlns:cx8="http://schemas.microsoft.com/office/drawing/2016/5/14/chartex" xmlns:mc="http://schemas.openxmlformats.org/markup-compatibility/2006" xmlns:aink="http://schemas.microsoft.com/office/drawing/2016/ink" xmlns:am3d="http://schemas.microsoft.com/office/drawing/2017/model3d" xmlns:o="urn:schemas-microsoft-com:office:office" xmlns:oel="http://schemas.microsoft.com/office/2019/extlst" xmlns:r="http://schemas.openxmlformats.org/officeDocument/2006/relationships" xmlns:m="http://schemas.openxmlformats.org/officeDocument/2006/math" xmlns:v="urn:schemas-microsoft-com:vml" xmlns:wp14="http://schemas.microsoft.com/office/word/2010/wordprocessingDrawing" xmlns:wp="http://schemas.openxmlformats.org/drawingml/2006/wordprocessingDrawing" xmlns:w10="urn:schemas-microsoft-com:office:word" xmlns:w="http://schemas.openxmlformats.org/wordprocessingml/2006/main" xmlns:w14="http://schemas.microsoft.com/office/word/2010/wordml" xmlns:w15="http://schemas.microsoft.com/office/word/2012/wordml" xmlns:w16cex="http://schemas.microsoft.com/office/word/2018/wordml/cex" xmlns:w16cid="http://schemas.microsoft.com/office/word/2016/wordml/cid" xmlns:w16="http://schemas.microsoft.com/office/word/2018/wordml" xmlns:w16du="http://schemas.microsoft.com/office/word/2023/wordml/word16du" xmlns:w16sdtdh="http://schemas.microsoft.com/office/word/2020/wordml/sdtdatahash" xmlns:w16sdtfl="http://schemas.microsoft.com/office/word/2024/wordml/sdtformatlock" xmlns:w16se="http://schemas.microsoft.com/office/word/2015/wordml/symex" xmlns:wpg="http://schemas.microsoft.com/office/word/2010/wordprocessingGroup" xmlns:wpi="http://schemas.microsoft.com/office/word/2010/wordprocessingInk" xmlns:wne="http://schemas.microsoft.com/office/word/2006/wordml" xmlns:wps="http://schemas.microsoft.com/office/word/2010/wordprocessingShape" mc:Ignorable="w14 w15 w16se w16cid w16 w16cex w16sdtdh w16sdtfl w16du wp14">
   <w:abstractNum w:abstractNumId="0" w15:restartNumberingAfterBreak="0">
+    <w:nsid w:val="169A3C8F"/>
+    <w:multiLevelType w:val="multilevel"/>
+    <w:tmpl w:val="EF7E45B8"/>
+    <w:lvl w:ilvl="0">
+      <w:start w:val="1"/>
+      <w:numFmt w:val="bullet"/>
+      <w:lvlText w:val=""/>
+      <w:lvlJc w:val="left"/>
+      <w:pPr>
+        <w:tabs>
+          <w:tab w:val="num" w:pos="720"/>
+        </w:tabs>
+        <w:ind w:left="720" w:hanging="360"/>
+      </w:pPr>
+      <w:rPr>
+        <w:rFonts w:ascii="Symbol" w:hAnsi="Symbol" w:hint="default"/>
+        <w:sz w:val="20"/>
+      </w:rPr>
+    </w:lvl>
+    <w:lvl w:ilvl="1" w:tentative="1">
+      <w:start w:val="1"/>
+      <w:numFmt w:val="bullet"/>
+      <w:lvlText w:val=""/>
+      <w:lvlJc w:val="left"/>
+      <w:pPr>
+        <w:tabs>
+          <w:tab w:val="num" w:pos="1440"/>
+        </w:tabs>
+        <w:ind w:left="1440" w:hanging="360"/>
+      </w:pPr>
+      <w:rPr>
+        <w:rFonts w:ascii="Symbol" w:hAnsi="Symbol" w:hint="default"/>
+        <w:sz w:val="20"/>
+      </w:rPr>
+    </w:lvl>
+    <w:lvl w:ilvl="2" w:tentative="1">
+      <w:start w:val="1"/>
+      <w:numFmt w:val="bullet"/>
+      <w:lvlText w:val=""/>
+      <w:lvlJc w:val="left"/>
+      <w:pPr>
+        <w:tabs>
+          <w:tab w:val="num" w:pos="2160"/>
+        </w:tabs>
+        <w:ind w:left="2160" w:hanging="360"/>
+      </w:pPr>
+      <w:rPr>
+        <w:rFonts w:ascii="Symbol" w:hAnsi="Symbol" w:hint="default"/>
+        <w:sz w:val="20"/>
+      </w:rPr>
+    </w:lvl>
+    <w:lvl w:ilvl="3" w:tentative="1">
+      <w:start w:val="1"/>
+      <w:numFmt w:val="bullet"/>
+      <w:lvlText w:val=""/>
+      <w:lvlJc w:val="left"/>
+      <w:pPr>
+        <w:tabs>
+          <w:tab w:val="num" w:pos="2880"/>
+        </w:tabs>
+        <w:ind w:left="2880" w:hanging="360"/>
+      </w:pPr>
+      <w:rPr>
+        <w:rFonts w:ascii="Symbol" w:hAnsi="Symbol" w:hint="default"/>
+        <w:sz w:val="20"/>
+      </w:rPr>
+    </w:lvl>
+    <w:lvl w:ilvl="4" w:tentative="1">
+      <w:start w:val="1"/>
+      <w:numFmt w:val="bullet"/>
+      <w:lvlText w:val=""/>
+      <w:lvlJc w:val="left"/>
+      <w:pPr>
+        <w:tabs>
+          <w:tab w:val="num" w:pos="3600"/>
+        </w:tabs>
+        <w:ind w:left="3600" w:hanging="360"/>
+      </w:pPr>
+      <w:rPr>
+        <w:rFonts w:ascii="Symbol" w:hAnsi="Symbol" w:hint="default"/>
+        <w:sz w:val="20"/>
+      </w:rPr>
+    </w:lvl>
+    <w:lvl w:ilvl="5" w:tentative="1">
+      <w:start w:val="1"/>
+      <w:numFmt w:val="bullet"/>
+      <w:lvlText w:val=""/>
+      <w:lvlJc w:val="left"/>
+      <w:pPr>
+        <w:tabs>
+          <w:tab w:val="num" w:pos="4320"/>
+        </w:tabs>
+        <w:ind w:left="4320" w:hanging="360"/>
+      </w:pPr>
+      <w:rPr>
+        <w:rFonts w:ascii="Symbol" w:hAnsi="Symbol" w:hint="default"/>
+        <w:sz w:val="20"/>
+      </w:rPr>
+    </w:lvl>
+    <w:lvl w:ilvl="6" w:tentative="1">
+      <w:start w:val="1"/>
+      <w:numFmt w:val="bullet"/>
+      <w:lvlText w:val=""/>
+      <w:lvlJc w:val="left"/>
+      <w:pPr>
+        <w:tabs>
+          <w:tab w:val="num" w:pos="5040"/>
+        </w:tabs>
+        <w:ind w:left="5040" w:hanging="360"/>
+      </w:pPr>
+      <w:rPr>
+        <w:rFonts w:ascii="Symbol" w:hAnsi="Symbol" w:hint="default"/>
+        <w:sz w:val="20"/>
+      </w:rPr>
+    </w:lvl>
+    <w:lvl w:ilvl="7" w:tentative="1">
+      <w:start w:val="1"/>
+      <w:numFmt w:val="bullet"/>
+      <w:lvlText w:val=""/>
+      <w:lvlJc w:val="left"/>
+      <w:pPr>
+        <w:tabs>
+          <w:tab w:val="num" w:pos="5760"/>
+        </w:tabs>
+        <w:ind w:left="5760" w:hanging="360"/>
+      </w:pPr>
+      <w:rPr>
+        <w:rFonts w:ascii="Symbol" w:hAnsi="Symbol" w:hint="default"/>
+        <w:sz w:val="20"/>
+      </w:rPr>
+    </w:lvl>
+    <w:lvl w:ilvl="8" w:tentative="1">
+      <w:start w:val="1"/>
+      <w:numFmt w:val="bullet"/>
+      <w:lvlText w:val=""/>
+      <w:lvlJc w:val="left"/>
+      <w:pPr>
+        <w:tabs>
+          <w:tab w:val="num" w:pos="6480"/>
+        </w:tabs>
+        <w:ind w:left="6480" w:hanging="360"/>
+      </w:pPr>
+      <w:rPr>
+        <w:rFonts w:ascii="Symbol" w:hAnsi="Symbol" w:hint="default"/>
+        <w:sz w:val="20"/>
+      </w:rPr>
+    </w:lvl>
+  </w:abstractNum>
+  <w:abstractNum w:abstractNumId="1" w15:restartNumberingAfterBreak="0">
     <w:nsid w:val="1A4162C8"/>
     <w:multiLevelType w:val="hybridMultilevel"/>
     <w:tmpl w:val="DC544226"/>
@@ -1113,7 +1337,7 @@
       </w:rPr>
     </w:lvl>
   </w:abstractNum>
-  <w:abstractNum w:abstractNumId="1" w15:restartNumberingAfterBreak="0">
+  <w:abstractNum w:abstractNumId="2" w15:restartNumberingAfterBreak="0">
     <w:nsid w:val="2D5728BC"/>
     <w:multiLevelType w:val="hybridMultilevel"/>
     <w:tmpl w:val="EE62DBB8"/>
@@ -1227,10 +1451,13 @@
     </w:lvl>
   </w:abstractNum>
   <w:num w:numId="1" w16cid:durableId="2132437643">
-    <w:abstractNumId w:val="0"/>
+    <w:abstractNumId w:val="1"/>
   </w:num>
   <w:num w:numId="2" w16cid:durableId="90509450">
-    <w:abstractNumId w:val="1"/>
+    <w:abstractNumId w:val="2"/>
+  </w:num>
+  <w:num w:numId="3" w16cid:durableId="302389147">
+    <w:abstractNumId w:val="0"/>
   </w:num>
 </w:numbering>
 </file>
@@ -2151,6 +2378,29 @@
       <w:spacing w:val="5"/>
     </w:rPr>
   </w:style>
+  <w:style w:type="character" w:styleId="Hipervnculo">
+    <w:name w:val="Hyperlink"/>
+    <w:basedOn w:val="Fuentedeprrafopredeter"/>
+    <w:uiPriority w:val="99"/>
+    <w:unhideWhenUsed/>
+    <w:rsid w:val="00DE7F04"/>
+    <w:rPr>
+      <w:color w:val="467886" w:themeColor="hyperlink"/>
+      <w:u w:val="single"/>
+    </w:rPr>
+  </w:style>
+  <w:style w:type="character" w:styleId="Mencinsinresolver">
+    <w:name w:val="Unresolved Mention"/>
+    <w:basedOn w:val="Fuentedeprrafopredeter"/>
+    <w:uiPriority w:val="99"/>
+    <w:semiHidden/>
+    <w:unhideWhenUsed/>
+    <w:rsid w:val="00DE7F04"/>
+    <w:rPr>
+      <w:color w:val="605E5C"/>
+      <w:shd w:val="clear" w:color="auto" w:fill="E1DFDD"/>
+    </w:rPr>
+  </w:style>
 </w:styles>
 </file>
 

</xml_diff>